<commit_message>
chore: remove temporary document file and update project documentation
</commit_message>
<xml_diff>
--- a/SKRIPSI DEO.docx
+++ b/SKRIPSI DEO.docx
@@ -7674,10 +7674,10 @@
         </w:p>
       </w:sdtContent>
     </w:sdt>
-    <w:bookmarkStart w:id="10" w:name="_Toc491073684" w:displacedByCustomXml="prev"/>
-    <w:bookmarkStart w:id="11" w:name="_Toc491073457" w:displacedByCustomXml="prev"/>
-    <w:bookmarkStart w:id="12" w:name="_Toc490782368" w:displacedByCustomXml="prev"/>
-    <w:bookmarkStart w:id="13" w:name="_Toc459313582" w:displacedByCustomXml="prev"/>
+    <w:bookmarkStart w:id="10" w:name="_Toc459313582" w:displacedByCustomXml="prev"/>
+    <w:bookmarkStart w:id="11" w:name="_Toc490782368" w:displacedByCustomXml="prev"/>
+    <w:bookmarkStart w:id="12" w:name="_Toc491073457" w:displacedByCustomXml="prev"/>
+    <w:bookmarkStart w:id="13" w:name="_Toc491073684" w:displacedByCustomXml="prev"/>
     <w:p>
       <w:pPr>
         <w:rPr>
@@ -11260,7 +11260,7 @@
           <w:szCs w:val="24"/>
           <w:lang w:val="id-ID"/>
         </w:rPr>
-        <w:t>Bagaimana merancang sistem informasi manajemen bengkel dinamo yang terintegrasi untuk mendukung pengelolaan stok sparepart dan penyampaian informasi layanan pada Bengkel Cak Budi Dinamo</w:t>
+        <w:t>Bagaimana</w:t>
       </w:r>
       <w:r>
         <w:rPr>
@@ -11268,7 +11268,7 @@
           <w:szCs w:val="24"/>
           <w:lang w:val="id-ID"/>
         </w:rPr>
-        <w:t xml:space="preserve"> menggunakan metode prototype</w:t>
+        <w:t xml:space="preserve"> </w:t>
       </w:r>
       <w:r>
         <w:rPr>
@@ -11276,7 +11276,7 @@
           <w:szCs w:val="24"/>
           <w:lang w:val="id-ID"/>
         </w:rPr>
-        <w:t>?</w:t>
+        <w:t>merancang dan mengembangkan sistem informasi manajemen bengkel dinamo menggunakan metode Prototype untuk mendukung pengelolaan stok sparepart dan layanan servis pada Bengkel Cak Budi Dinamo?</w:t>
       </w:r>
     </w:p>
     <w:p>
@@ -22507,7 +22507,7 @@
           <w:lang w:val="id-ID"/>
         </w:rPr>
         <w:drawing>
-          <wp:inline distT="0" distB="0" distL="0" distR="0" wp14:anchorId="3EEEFD1C" wp14:editId="7F55F128">
+          <wp:inline distT="0" distB="0" distL="0" distR="0" wp14:anchorId="3EEEFD1C" wp14:editId="05D6273D">
             <wp:extent cx="4643686" cy="3365500"/>
             <wp:effectExtent l="19050" t="19050" r="24130" b="25400"/>
             <wp:docPr id="1479933244" name="Picture 2"/>
@@ -22621,7 +22621,7 @@
           <w:noProof/>
         </w:rPr>
         <w:drawing>
-          <wp:inline distT="0" distB="0" distL="0" distR="0" wp14:anchorId="5F5F550C" wp14:editId="7826B0B4">
+          <wp:inline distT="0" distB="0" distL="0" distR="0" wp14:anchorId="5F5F550C" wp14:editId="28BA1576">
             <wp:extent cx="5025390" cy="3594100"/>
             <wp:effectExtent l="19050" t="19050" r="22860" b="25400"/>
             <wp:docPr id="979148635" name="Picture 12"/>
@@ -34389,7 +34389,6 @@
   <w:style w:type="character" w:default="1" w:styleId="DefaultParagraphFont">
     <w:name w:val="Default Paragraph Font"/>
     <w:uiPriority w:val="1"/>
-    <w:semiHidden/>
     <w:unhideWhenUsed/>
   </w:style>
   <w:style w:type="table" w:default="1" w:styleId="TableNormal">
@@ -35884,6 +35883,7 @@
     <w:rsid w:val="000C322D"/>
     <w:rsid w:val="000F7FB3"/>
     <w:rsid w:val="0014127E"/>
+    <w:rsid w:val="00163F99"/>
     <w:rsid w:val="002563E2"/>
     <w:rsid w:val="00337E36"/>
     <w:rsid w:val="003858E2"/>
@@ -35894,6 +35894,7 @@
     <w:rsid w:val="00654D11"/>
     <w:rsid w:val="006A3DCC"/>
     <w:rsid w:val="006C4F04"/>
+    <w:rsid w:val="00730162"/>
     <w:rsid w:val="007749C1"/>
     <w:rsid w:val="00783F40"/>
     <w:rsid w:val="007A42DF"/>
@@ -36670,6 +36671,15 @@
 </file>
 
 <file path=customXml/item1.xml><?xml version="1.0" encoding="utf-8"?>
+<?mso-contentType ?>
+<FormTemplates xmlns="http://schemas.microsoft.com/sharepoint/v3/contenttype/forms">
+  <Display>DocumentLibraryForm</Display>
+  <Edit>DocumentLibraryForm</Edit>
+  <New>DocumentLibraryForm</New>
+</FormTemplates>
+</file>
+
+<file path=customXml/item2.xml><?xml version="1.0" encoding="utf-8"?>
 <ct:contentTypeSchema xmlns:ct="http://schemas.microsoft.com/office/2006/metadata/contentType" xmlns:ma="http://schemas.microsoft.com/office/2006/metadata/properties/metaAttributes" ct:_="" ma:_="" ma:contentTypeName="Document" ma:contentTypeID="0x01010023CC760782FD26458A6F83ED90B56D27" ma:contentTypeVersion="13" ma:contentTypeDescription="Create a new document." ma:contentTypeScope="" ma:versionID="9e84a92491ab8b9cd705a1b5516d0852">
   <xsd:schema xmlns:xsd="http://www.w3.org/2001/XMLSchema" xmlns:xs="http://www.w3.org/2001/XMLSchema" xmlns:p="http://schemas.microsoft.com/office/2006/metadata/properties" xmlns:ns2="5d1b2be0-dc14-4fc3-af61-5302e23bdb5f" xmlns:ns3="4f3f8d1b-0201-4c51-93bf-926e48e22457" targetNamespace="http://schemas.microsoft.com/office/2006/metadata/properties" ma:root="true" ma:fieldsID="95de54e4a83e5a628e999e6ef383d419" ns2:_="" ns3:_="">
     <xsd:import namespace="5d1b2be0-dc14-4fc3-af61-5302e23bdb5f"/>
@@ -36876,16 +36886,11 @@
 </ct:contentTypeSchema>
 </file>
 
-<file path=customXml/item2.xml><?xml version="1.0" encoding="utf-8"?>
-<?mso-contentType ?>
-<FormTemplates xmlns="http://schemas.microsoft.com/sharepoint/v3/contenttype/forms">
-  <Display>DocumentLibraryForm</Display>
-  <Edit>DocumentLibraryForm</Edit>
-  <New>DocumentLibraryForm</New>
-</FormTemplates>
+<file path=customXml/item3.xml><?xml version="1.0" encoding="utf-8"?>
+<b:Sources xmlns:b="http://schemas.openxmlformats.org/officeDocument/2006/bibliography" xmlns="http://schemas.openxmlformats.org/officeDocument/2006/bibliography" SelectedStyle="\APA.XSL" StyleName="APA"/>
 </file>
 
-<file path=customXml/item3.xml><?xml version="1.0" encoding="utf-8"?>
+<file path=customXml/item4.xml><?xml version="1.0" encoding="utf-8"?>
 <p:properties xmlns:p="http://schemas.microsoft.com/office/2006/metadata/properties" xmlns:xsi="http://www.w3.org/2001/XMLSchema-instance" xmlns:pc="http://schemas.microsoft.com/office/infopath/2007/PartnerControls">
   <documentManagement>
     <TaxCatchAll xmlns="4f3f8d1b-0201-4c51-93bf-926e48e22457" xsi:nil="true"/>
@@ -36896,11 +36901,15 @@
 </p:properties>
 </file>
 
-<file path=customXml/item4.xml><?xml version="1.0" encoding="utf-8"?>
-<b:Sources xmlns:b="http://schemas.openxmlformats.org/officeDocument/2006/bibliography" xmlns="http://schemas.openxmlformats.org/officeDocument/2006/bibliography" SelectedStyle="\APA.XSL" StyleName="APA"/>
+<file path=customXml/itemProps1.xml><?xml version="1.0" encoding="utf-8"?>
+<ds:datastoreItem xmlns:ds="http://schemas.openxmlformats.org/officeDocument/2006/customXml" ds:itemID="{E50B5476-CDC4-4B2C-8FA4-91EA9B417D53}">
+  <ds:schemaRefs>
+    <ds:schemaRef ds:uri="http://schemas.microsoft.com/sharepoint/v3/contenttype/forms"/>
+  </ds:schemaRefs>
+</ds:datastoreItem>
 </file>
 
-<file path=customXml/itemProps1.xml><?xml version="1.0" encoding="utf-8"?>
+<file path=customXml/itemProps2.xml><?xml version="1.0" encoding="utf-8"?>
 <ds:datastoreItem xmlns:ds="http://schemas.openxmlformats.org/officeDocument/2006/customXml" ds:itemID="{0264D62E-2016-472B-BAAB-62F6C1BDA06F}">
   <ds:schemaRefs>
     <ds:schemaRef ds:uri="http://schemas.microsoft.com/office/2006/metadata/contentType"/>
@@ -36919,15 +36928,15 @@
 </ds:datastoreItem>
 </file>
 
-<file path=customXml/itemProps2.xml><?xml version="1.0" encoding="utf-8"?>
-<ds:datastoreItem xmlns:ds="http://schemas.openxmlformats.org/officeDocument/2006/customXml" ds:itemID="{E50B5476-CDC4-4B2C-8FA4-91EA9B417D53}">
+<file path=customXml/itemProps3.xml><?xml version="1.0" encoding="utf-8"?>
+<ds:datastoreItem xmlns:ds="http://schemas.openxmlformats.org/officeDocument/2006/customXml" ds:itemID="{03F772C0-5529-4C55-891D-4DC6DA9A3494}">
   <ds:schemaRefs>
-    <ds:schemaRef ds:uri="http://schemas.microsoft.com/sharepoint/v3/contenttype/forms"/>
+    <ds:schemaRef ds:uri="http://schemas.openxmlformats.org/officeDocument/2006/bibliography"/>
   </ds:schemaRefs>
 </ds:datastoreItem>
 </file>
 
-<file path=customXml/itemProps3.xml><?xml version="1.0" encoding="utf-8"?>
+<file path=customXml/itemProps4.xml><?xml version="1.0" encoding="utf-8"?>
 <ds:datastoreItem xmlns:ds="http://schemas.openxmlformats.org/officeDocument/2006/customXml" ds:itemID="{103F14F1-2374-4ABD-8B1B-6CBAEA194091}">
   <ds:schemaRefs>
     <ds:schemaRef ds:uri="http://schemas.microsoft.com/office/2006/metadata/properties"/>
@@ -36936,12 +36945,4 @@
     <ds:schemaRef ds:uri="5d1b2be0-dc14-4fc3-af61-5302e23bdb5f"/>
   </ds:schemaRefs>
 </ds:datastoreItem>
-</file>
-
-<file path=customXml/itemProps4.xml><?xml version="1.0" encoding="utf-8"?>
-<ds:datastoreItem xmlns:ds="http://schemas.openxmlformats.org/officeDocument/2006/customXml" ds:itemID="{03F772C0-5529-4C55-891D-4DC6DA9A3494}">
-  <ds:schemaRefs>
-    <ds:schemaRef ds:uri="http://schemas.openxmlformats.org/officeDocument/2006/bibliography"/>
-  </ds:schemaRefs>
-</ds:datastoreItem>
 </file>
</xml_diff>